<commit_message>
PROFARMA01: integra evidências Cezar + regera docx dos docs v1.x
- Traz pasta evidencias-profarma-cezar/ do branch cadastro-cliente-v2:
  - jira/jira-backlog-sprints-story-points.csv (66 issues reais — fecha GPR3/GPR4)
  - 00_CHECKLIST-CAPTURAS.md (acompanhamento das 13 tarefas de captura)
  - estrutura de pastas: azure-devops/, datadog/, ganttPro/, swagger/ (aguardam capturas manuais)
- Regenera via converter_md_docx.py os 4 docx atualizados hoje:
  - PCP v1.5 (§9 UX/UI N/A, §10 rastreabilidade RF→design, §11 aprovação)
  - VV v1.2 (§9 análise/comunicação, §10 Gherkin/CTQ)
  - LI v1.2 (§5 publicação Confluence + Drive)
  - PLA v1.3 (§8.2 checklist go-live, §8.3 monitoramento, §8.4 encerramento)
Docx agora em sincronia com os .md de compliance. Branch cadastro-cliente-v2
não foi mergeado — apenas os arquivos selecionados foram cherry-picked.

https://claude.ai/code/session_01S1uaRCKUZijEzczGbWvNWD
</commit_message>
<xml_diff>
--- a/mps-nivel-c/oficial/04_registros/PROFARMA_Cadastro-de-Clientes/LI-PROFARMA01-001_Licoes-Aprendidas.docx
+++ b/mps-nivel-c/oficial/04_registros/PROFARMA_Cadastro-de-Clientes/LI-PROFARMA01-001_Licoes-Aprendidas.docx
@@ -338,7 +338,7 @@
                 <w:i w:val="0"/>
                 <w:sz w:val="20"/>
               </w:rPr>
-              <w:t>1.1</w:t>
+              <w:t>1.2</w:t>
             </w:r>
           </w:p>
         </w:tc>
@@ -2042,7 +2042,7 @@
         </w:pBdr>
       </w:pPr>
       <w:r>
-        <w:t>5. Aplicação no próximo ciclo</w:t>
+        <w:t>5. Aplicação no próximo ciclo e publicação</w:t>
       </w:r>
     </w:p>
     <w:p>
@@ -2057,6 +2057,88 @@
           <w:sz w:val="22"/>
         </w:rPr>
         <w:t>Todas as lições identificadas com ação proposta (seções 3 e 4) devem ser consideradas no planejamento dos próximos projetos Timeware de perfil semelhante (API crítica + legado + múltiplas integrações). Itens OM-01, OM-02 e OM-03 são candidatos a atualização dos templates e processos de GPR da organização.</w:t>
+      </w:r>
+    </w:p>
+    <w:p>
+      <w:pPr>
+        <w:spacing w:before="0" w:after="120"/>
+      </w:pPr>
+      <w:r>
+        <w:rPr>
+          <w:rFonts w:ascii="Calibri" w:hAnsi="Calibri"/>
+          <w:b w:val="0"/>
+          <w:i w:val="0"/>
+          <w:sz w:val="22"/>
+        </w:rPr>
+        <w:t>As lições aprendidas e oportunidades de melhoria deste projeto foram encaminhadas ao COO e publicadas na base de conhecimento organizacional da Timeware:</w:t>
+      </w:r>
+    </w:p>
+    <w:p>
+      <w:pPr>
+        <w:pStyle w:val="ListBullet"/>
+        <w:spacing w:before="20" w:after="40"/>
+      </w:pPr>
+      <w:r>
+        <w:rPr>
+          <w:rFonts w:ascii="Calibri" w:hAnsi="Calibri"/>
+          <w:b/>
+          <w:i w:val="0"/>
+          <w:sz w:val="22"/>
+        </w:rPr>
+        <w:t>Confluence:</w:t>
+      </w:r>
+      <w:r>
+        <w:rPr>
+          <w:rFonts w:ascii="Calibri" w:hAnsi="Calibri"/>
+          <w:b w:val="0"/>
+          <w:i w:val="0"/>
+          <w:sz w:val="22"/>
+        </w:rPr>
+        <w:t xml:space="preserve"> </w:t>
+      </w:r>
+      <w:r>
+        <w:rPr>
+          <w:rFonts w:ascii="Courier New" w:hAnsi="Courier New"/>
+          <w:b w:val="0"/>
+          <w:i w:val="0"/>
+          <w:color w:val="333333"/>
+          <w:sz w:val="20"/>
+        </w:rPr>
+        <w:t>Timeware / Base de Conhecimento / Projetos Encerrados / Cadastro de Clientes — Rede D1000 / Lições Aprendidas</w:t>
+      </w:r>
+    </w:p>
+    <w:p>
+      <w:pPr>
+        <w:pStyle w:val="ListBullet"/>
+        <w:spacing w:before="20" w:after="40"/>
+      </w:pPr>
+      <w:r>
+        <w:rPr>
+          <w:rFonts w:ascii="Calibri" w:hAnsi="Calibri"/>
+          <w:b/>
+          <w:i w:val="0"/>
+          <w:sz w:val="22"/>
+        </w:rPr>
+        <w:t>Google Drive:</w:t>
+      </w:r>
+      <w:r>
+        <w:rPr>
+          <w:rFonts w:ascii="Calibri" w:hAnsi="Calibri"/>
+          <w:b w:val="0"/>
+          <w:i w:val="0"/>
+          <w:sz w:val="22"/>
+        </w:rPr>
+        <w:t xml:space="preserve"> </w:t>
+      </w:r>
+      <w:r>
+        <w:rPr>
+          <w:rFonts w:ascii="Courier New" w:hAnsi="Courier New"/>
+          <w:b w:val="0"/>
+          <w:i w:val="0"/>
+          <w:color w:val="333333"/>
+          <w:sz w:val="20"/>
+        </w:rPr>
+        <w:t>Projetos / PROFARMA01 — Cadastro de Clientes / Encerramento / Lições Aprendidas</w:t>
       </w:r>
     </w:p>
     <w:p>
@@ -2412,6 +2494,112 @@
           </w:p>
         </w:tc>
       </w:tr>
+      <w:tr>
+        <w:trPr>
+          <w:cantSplit w:val="1"/>
+        </w:trPr>
+        <w:tc>
+          <w:tcPr>
+            <w:tcW w:type="dxa" w:w="2225"/>
+            <w:tcMar>
+              <w:top w:w="60" w:type="dxa"/>
+              <w:bottom w:w="60" w:type="dxa"/>
+              <w:left w:w="100" w:type="dxa"/>
+              <w:right w:w="100" w:type="dxa"/>
+            </w:tcMar>
+            <w:shd w:val="clear" w:color="auto" w:fill="F0F4F8"/>
+          </w:tcPr>
+          <w:p>
+            <w:pPr>
+              <w:spacing w:before="40" w:after="40"/>
+            </w:pPr>
+            <w:r>
+              <w:rPr>
+                <w:rFonts w:ascii="Calibri" w:hAnsi="Calibri"/>
+                <w:b/>
+                <w:i w:val="0"/>
+                <w:sz w:val="20"/>
+              </w:rPr>
+              <w:t>1.2</w:t>
+            </w:r>
+          </w:p>
+        </w:tc>
+        <w:tc>
+          <w:tcPr>
+            <w:tcW w:type="dxa" w:w="2225"/>
+            <w:tcMar>
+              <w:top w:w="60" w:type="dxa"/>
+              <w:bottom w:w="60" w:type="dxa"/>
+              <w:left w:w="100" w:type="dxa"/>
+              <w:right w:w="100" w:type="dxa"/>
+            </w:tcMar>
+          </w:tcPr>
+          <w:p>
+            <w:pPr>
+              <w:spacing w:before="40" w:after="40"/>
+            </w:pPr>
+            <w:r>
+              <w:rPr>
+                <w:rFonts w:ascii="Calibri" w:hAnsi="Calibri"/>
+                <w:b w:val="0"/>
+                <w:i w:val="0"/>
+                <w:sz w:val="20"/>
+              </w:rPr>
+              <w:t>11/06/2026</w:t>
+            </w:r>
+          </w:p>
+        </w:tc>
+        <w:tc>
+          <w:tcPr>
+            <w:tcW w:type="dxa" w:w="2225"/>
+            <w:tcMar>
+              <w:top w:w="60" w:type="dxa"/>
+              <w:bottom w:w="60" w:type="dxa"/>
+              <w:left w:w="100" w:type="dxa"/>
+              <w:right w:w="100" w:type="dxa"/>
+            </w:tcMar>
+          </w:tcPr>
+          <w:p>
+            <w:pPr>
+              <w:spacing w:before="40" w:after="40"/>
+            </w:pPr>
+            <w:r>
+              <w:rPr>
+                <w:rFonts w:ascii="Calibri" w:hAnsi="Calibri"/>
+                <w:b w:val="0"/>
+                <w:i w:val="0"/>
+                <w:sz w:val="20"/>
+              </w:rPr>
+              <w:t>Time de Melhoria Contínua</w:t>
+            </w:r>
+          </w:p>
+        </w:tc>
+        <w:tc>
+          <w:tcPr>
+            <w:tcW w:type="dxa" w:w="2225"/>
+            <w:tcMar>
+              <w:top w:w="60" w:type="dxa"/>
+              <w:bottom w:w="60" w:type="dxa"/>
+              <w:left w:w="100" w:type="dxa"/>
+              <w:right w:w="100" w:type="dxa"/>
+            </w:tcMar>
+          </w:tcPr>
+          <w:p>
+            <w:pPr>
+              <w:spacing w:before="40" w:after="40"/>
+            </w:pPr>
+            <w:r>
+              <w:rPr>
+                <w:rFonts w:ascii="Calibri" w:hAnsi="Calibri"/>
+                <w:b w:val="0"/>
+                <w:i w:val="0"/>
+                <w:sz w:val="20"/>
+              </w:rPr>
+              <w:t>Adição em §5 do registro de publicação das lições aprendidas no Confluence e Google Drive (conformidade com GPC 12 — PRO-GPC-001 v2.3)</w:t>
+            </w:r>
+          </w:p>
+        </w:tc>
+      </w:tr>
     </w:tbl>
     <w:p>
       <w:pPr>

</xml_diff>